<commit_message>
Apply reviewer corrections: translate all inline Qurʾān verses + fixes
Based on the annotated PDF review:
- Added German translations to 97 inline Qurʾān verses that previously showed
  only Arabic + reference (the reviewer's main, repeated instruction
  "Übersetzung bei jedem Vers"). Every inline verse now reads Arabic + German
  gloss + [Sūrah: verse], matching the display-block verses.
- Fixed the reversed sentence on the Īmān-billāh intro: it is Allah who sees
  the servant (not the servant seeing Allah) — "sodass Allah ﷻ ihn nicht an
  einem Ort sieht, an dem Er ihn nicht zu sehen wünscht".
- Clarified the definition of Salaf aṣ-Ṣāliḥ as "die ersten drei Generationen".
- Rebuilt PDF (84 pages), HTML and DOCX.

Co-Authored-By: Claude Sonnet 4.6 <noreply@anthropic.com>
Claude-Session: https://claude.ai/code/session_01X1aRXJ65Ndnus7RGkwMuBq
</commit_message>
<xml_diff>
--- a/aqidah_lektionen_deutsch_final.docx
+++ b/aqidah_lektionen_deutsch_final.docx
@@ -1183,7 +1183,7 @@
         <w:t xml:space="preserve"> </w:t>
       </w:r>
       <w:r>
-        <w:t xml:space="preserve">hervor; und wenn der Diener Allah liebt, eilt er zur Befolgung Seiner Befehle. Er sieht dann Allah</w:t>
+        <w:t xml:space="preserve">hervor; und wenn der Diener Allah liebt, eilt er zur Befolgung Seiner Befehle, sodass Allah</w:t>
       </w:r>
       <w:r>
         <w:t xml:space="preserve"> </w:t>
@@ -1195,7 +1195,7 @@
         <w:t xml:space="preserve"> </w:t>
       </w:r>
       <w:r>
-        <w:t xml:space="preserve">nicht an einem Ort, an dem Er nicht gesehen werden möchte, und der Diener spricht kein Wort aus, das Allah erzürnt – weil er weiß, dass Allah</w:t>
+        <w:t xml:space="preserve">ihn nicht an einem Ort sieht, an dem Er ihn nicht zu sehen wünscht (d. h. an einem Ort des Ungehorsams); und der Diener spricht kein Wort aus, das Allah erzürnt – weil er weiß, dass Allah</w:t>
       </w:r>
       <w:r>
         <w:t xml:space="preserve"> </w:t>
@@ -1823,7 +1823,7 @@
         <w:t xml:space="preserve"> </w:t>
       </w:r>
       <w:r>
-        <w:t xml:space="preserve">sind: die Gefährten und diejenigen, die ihnen in Güte folgten, aus den beiden Generationen nach der Generation der Gefährten.</w:t>
+        <w:t xml:space="preserve">sind: die Gefährten und diejenigen, die ihnen in Güte folgten, aus den beiden Generationen nach der Generation der Gefährten (also die ersten drei Generationen).</w:t>
       </w:r>
     </w:p>
     <w:p>
@@ -6677,7 +6677,7 @@
         <w:t xml:space="preserve"> </w:t>
       </w:r>
       <w:r>
-        <w:t xml:space="preserve">[Nūḥ: 1-3].</w:t>
+        <w:t xml:space="preserve">„Wahrlich, Wir sandten Nūḥ zu seinem Volk: Warne dein Volk, bevor eine schmerzhafte Strafe über sie kommt. Er sagte: O mein Volk, ich bin euch ein deutlicher Warner: Dient Allah, fürchtet Ihn und gehorcht mir" [Nūḥ: 1-3].</w:t>
       </w:r>
     </w:p>
     <w:p>
@@ -7753,7 +7753,7 @@
         <w:t xml:space="preserve"> </w:t>
       </w:r>
       <w:r>
-        <w:t xml:space="preserve">[Hūd: 69-70].</w:t>
+        <w:t xml:space="preserve">„Und Unsere Gesandten kamen zu Ibrāhīm mit der frohen Botschaft. Sie sagten: Frieden! Er sagte: Friede! Und es dauerte nicht lange, da brachte er ein gebratenes Kalb. Als er aber sah, dass ihre Hände nicht danach griffen, fand er sie befremdlich" [Hūd: 69-70].</w:t>
       </w:r>
     </w:p>
     <w:p>
@@ -7855,7 +7855,7 @@
         <w:t xml:space="preserve"> </w:t>
       </w:r>
       <w:r>
-        <w:t xml:space="preserve">[an-Naǧm: 6] – das heißt: von schönem Anblick. Und die Frauen, die Yūsuf sahen, sagten:</w:t>
+        <w:t xml:space="preserve">„von schöner Gestalt (Kraft); dann richtete er sich auf" [an-Naǧm: 6] – das heißt: von schönem Anblick. Und die Frauen, die Yūsuf sahen, sagten:</w:t>
       </w:r>
       <w:r>
         <w:t xml:space="preserve"> </w:t>
@@ -7871,7 +7871,7 @@
         <w:t xml:space="preserve"> </w:t>
       </w:r>
       <w:r>
-        <w:t xml:space="preserve">[Yūsuf: 31]; denn bei ihnen stand fest, dass die Engel von schöner Gestalt sind.</w:t>
+        <w:t xml:space="preserve">„Behüte Allah! Das ist kein Mensch; das ist nur ein edler Engel" [Yūsuf: 31]; denn bei ihnen stand fest, dass die Engel von schöner Gestalt sind.</w:t>
       </w:r>
     </w:p>
     <w:p>
@@ -8008,7 +8008,7 @@
         <w:t xml:space="preserve"> </w:t>
       </w:r>
       <w:r>
-        <w:t xml:space="preserve">[Hūd: 69-70]; dieser Vers belegt, dass die Engel existierende, lebendige Wesen sind, die sprechen. Und die Existenz der Engel leugnet niemand außer ganz wenigen Abweichlern; sogar die, welche die Gesandten der Lüge bezichtigten – wie das Volk Nūḥs, das Volk ʿĀds und andere – glaubten an die Existenz der Engel, denn sie sagten:</w:t>
+        <w:t xml:space="preserve">„Und Unsere Gesandten kamen zu Ibrāhīm mit der frohen Botschaft …" [Hūd: 69-70]; dieser Vers belegt, dass die Engel existierende, lebendige Wesen sind, die sprechen. Und die Existenz der Engel leugnet niemand außer ganz wenigen Abweichlern; sogar die, welche die Gesandten der Lüge bezichtigten – wie das Volk Nūḥs, das Volk ʿĀds und andere – glaubten an die Existenz der Engel, denn sie sagten:</w:t>
       </w:r>
       <w:r>
         <w:t xml:space="preserve"> </w:t>
@@ -8024,7 +8024,7 @@
         <w:t xml:space="preserve"> </w:t>
       </w:r>
       <w:r>
-        <w:t xml:space="preserve">[al-Muʾminūn: 24].</w:t>
+        <w:t xml:space="preserve">„Und wenn Allah gewollt hätte, hätte Er wahrlich Engel herabgesandt" [al-Muʾminūn: 24].</w:t>
       </w:r>
     </w:p>
     <w:p>
@@ -8172,7 +8172,7 @@
         <w:t xml:space="preserve"> </w:t>
       </w:r>
       <w:r>
-        <w:t xml:space="preserve">[az-Zuḫruf: 80] – und anderes von den Werken der Engel.</w:t>
+        <w:t xml:space="preserve">„Oder meinen sie, dass Wir ihr Geheimes und ihre vertraulichen Gespräche nicht hören? Doch! Und Unsere Gesandten sind bei ihnen und schreiben (es) auf" [az-Zuḫruf: 80] – und anderes von den Werken der Engel.</w:t>
       </w:r>
     </w:p>
     <w:bookmarkEnd w:id="46"/>
@@ -8270,7 +8270,7 @@
         <w:t xml:space="preserve"> </w:t>
       </w:r>
       <w:r>
-        <w:t xml:space="preserve">[al-Baqarah: 97], und Er sagt:</w:t>
+        <w:t xml:space="preserve">„Sag: Wer (auch immer) Ǧibrīl feind ist – er ist es, der ihn (den Qurʾān) mit Allahs Erlaubnis auf dein Herz herabkommen ließ, das bestätigend, was vor ihm war, als Rechtleitung und frohe Botschaft für die Gläubigen" [al-Baqarah: 97], und Er sagt:</w:t>
       </w:r>
       <w:r>
         <w:t xml:space="preserve"> </w:t>
@@ -8286,7 +8286,7 @@
         <w:t xml:space="preserve"> </w:t>
       </w:r>
       <w:r>
-        <w:t xml:space="preserve">[al-Baqarah: 98].</w:t>
+        <w:t xml:space="preserve">„Wer (auch immer) Allah, Seinen Engeln, Seinen Gesandten, Ǧibrīl und Mīkāl feind ist – so ist Allah den Ungläubigen feind" [al-Baqarah: 98].</w:t>
       </w:r>
     </w:p>
     <w:p>
@@ -8320,7 +8320,7 @@
         <w:t xml:space="preserve"> </w:t>
       </w:r>
       <w:r>
-        <w:t xml:space="preserve">[al-Isrāʾ: 40]. Und Er, der Erhabene, sagt:</w:t>
+        <w:t xml:space="preserve">„Hat euer Herr etwa für euch die Söhne erwählt und Sich selbst unter den Engeln Töchter genommen? Ihr sagt da wahrlich ein gewaltiges Wort" [al-Isrāʾ: 40]. Und Er, der Erhabene, sagt:</w:t>
       </w:r>
       <w:r>
         <w:t xml:space="preserve"> </w:t>
@@ -8336,7 +8336,7 @@
         <w:t xml:space="preserve"> </w:t>
       </w:r>
       <w:r>
-        <w:t xml:space="preserve">[az-Zuḫruf: 19]. &gt;</w:t>
+        <w:t xml:space="preserve">„Und sie machen die Engel, die die Diener des Allerbarmers sind, zu weiblichen Wesen. Waren sie denn Zeugen ihrer Erschaffung? Ihr Zeugnis wird aufgeschrieben, und sie werden befragt werden" [az-Zuḫruf: 19]. &gt;</w:t>
       </w:r>
       <w:r>
         <w:t xml:space="preserve"> </w:t>
@@ -8368,7 +8368,7 @@
         <w:t xml:space="preserve"> </w:t>
       </w:r>
       <w:r>
-        <w:t xml:space="preserve">[al-Anbiyāʾ: 26].</w:t>
+        <w:t xml:space="preserve">„Und sie sagen: Der Allerbarmer hat Sich Kinder genommen. Preis sei Ihm! Nein, vielmehr sind es geehrte Diener" [al-Anbiyāʾ: 26].</w:t>
       </w:r>
     </w:p>
     <w:p>
@@ -8414,7 +8414,7 @@
         <w:t xml:space="preserve"> </w:t>
       </w:r>
       <w:r>
-        <w:t xml:space="preserve">[Āl ʿImrān: 80]. Der Glaube, dass sie etwas an Anbetung verdienen, ist von Allah</w:t>
+        <w:t xml:space="preserve">„Und Er gebietet euch nicht, euch die Engel und die Propheten zu Herren zu nehmen. Sollte Er euch den Unglauben gebieten, nachdem ihr Muslime seid?" [Āl ʿImrān: 80]. Der Glaube, dass sie etwas an Anbetung verdienen, ist von Allah</w:t>
       </w:r>
       <w:r>
         <w:t xml:space="preserve"> </w:t>
@@ -8469,7 +8469,7 @@
         <w:t xml:space="preserve"> </w:t>
       </w:r>
       <w:r>
-        <w:t xml:space="preserve">[an-Naml: 65] – niemand kennt das absolute Verborgene außer unserem Herrn</w:t>
+        <w:t xml:space="preserve">„Sag: Niemand in den Himmeln und auf der Erde kennt das Verborgene außer Allah; und sie merken nicht, wann sie auferweckt werden" [an-Naml: 65] – niemand kennt das absolute Verborgene außer unserem Herrn</w:t>
       </w:r>
       <w:r>
         <w:t xml:space="preserve"> </w:t>
@@ -8506,7 +8506,7 @@
         <w:t xml:space="preserve"> </w:t>
       </w:r>
       <w:r>
-        <w:t xml:space="preserve">[al-Baqarah: 31], woraufhin die Engel sagten:</w:t>
+        <w:t xml:space="preserve">„Und Er lehrte Ādam die Namen alle, dann legte Er sie den Engeln vor und sagte: Teilt Mir die Namen dieser (Dinge) mit, wenn ihr wahrhaftig seid" [al-Baqarah: 31], woraufhin die Engel sagten:</w:t>
       </w:r>
       <w:r>
         <w:t xml:space="preserve"> </w:t>
@@ -8522,7 +8522,7 @@
         <w:t xml:space="preserve"> </w:t>
       </w:r>
       <w:r>
-        <w:t xml:space="preserve">[al-Baqarah: 32]; das belegt, dass sie das Verborgene nicht kennen.</w:t>
+        <w:t xml:space="preserve">„Sie sagten: Preis sei Dir! Wir haben kein Wissen außer dem, was Du uns gelehrt hast. Du bist ja der Allwissende, der Allweise" [al-Baqarah: 32]; das belegt, dass sie das Verborgene nicht kennen.</w:t>
       </w:r>
     </w:p>
     <w:p>
@@ -8556,7 +8556,7 @@
         <w:t xml:space="preserve"> </w:t>
       </w:r>
       <w:r>
-        <w:t xml:space="preserve">[al-Baqarah: 98].</w:t>
+        <w:t xml:space="preserve">„Wer (auch immer) Allah, Seinen Engeln, Seinen Gesandten, Ǧibrīl und Mīkāl feind ist – so ist Allah den Ungläubigen feind" [al-Baqarah: 98].</w:t>
       </w:r>
     </w:p>
     <w:p>
@@ -8764,7 +8764,7 @@
         <w:t xml:space="preserve"> </w:t>
       </w:r>
       <w:r>
-        <w:t xml:space="preserve">[al-Baqarah: 75]; dies belegt, dass die Bücher, die Allah auf Seine Gesandten herabsandte, Seine Rede</w:t>
+        <w:t xml:space="preserve">„Begehrt ihr denn, dass sie euch glauben, wo doch eine Gruppe von ihnen das Wort Allahs hörte und es dann, nachdem sie es begriffen hatten, wissentlich verfälschte?" [al-Baqarah: 75]; dies belegt, dass die Bücher, die Allah auf Seine Gesandten herabsandte, Seine Rede</w:t>
       </w:r>
       <w:r>
         <w:t xml:space="preserve"> </w:t>
@@ -8839,7 +8839,7 @@
         <w:t xml:space="preserve"> </w:t>
       </w:r>
       <w:r>
-        <w:t xml:space="preserve">[aš-Šūrā: 15]; „mā" hier ist ein verbindendes Relativwort, das Allgemeinheit ausdrückt – im Sinne von: Ich glaube an alles, was Allah an Buch herabgesandt hat. Wer also nicht an jedes Buch glaubt, das Allah</w:t>
+        <w:t xml:space="preserve">„Und sag: Ich glaube an das, was Allah an Buch herabgesandt hat" [aš-Šūrā: 15]; „mā" hier ist ein verbindendes Relativwort, das Allgemeinheit ausdrückt – im Sinne von: Ich glaube an alles, was Allah an Buch herabgesandt hat. Wer also nicht an jedes Buch glaubt, das Allah</w:t>
       </w:r>
       <w:r>
         <w:t xml:space="preserve"> </w:t>
@@ -8943,7 +8943,7 @@
         <w:t xml:space="preserve"> </w:t>
       </w:r>
       <w:r>
-        <w:t xml:space="preserve">[al-Māʾidah: 44]; so müssen wir glauben, dass es ein Buch gibt, das Allah herabsandte, namens Tawrāh. Und ebenso das Inǧīl, wie Allah, der Erhabene, sagt:</w:t>
+        <w:t xml:space="preserve">„Wahrlich, Wir sandten die Tawrāh herab, in der Rechtleitung und Licht sind" [al-Māʾidah: 44]; so müssen wir glauben, dass es ein Buch gibt, das Allah herabsandte, namens Tawrāh. Und ebenso das Inǧīl, wie Allah, der Erhabene, sagt:</w:t>
       </w:r>
       <w:r>
         <w:t xml:space="preserve"> </w:t>
@@ -8959,7 +8959,7 @@
         <w:t xml:space="preserve"> </w:t>
       </w:r>
       <w:r>
-        <w:t xml:space="preserve">[al-Ḥadīd: 27]. Und der Zabūr, wie Allah, der Erhabene, sagt:</w:t>
+        <w:t xml:space="preserve">„Und Wir gaben ihm (ʿĪsā) das Inǧīl" [al-Ḥadīd: 27]. Und der Zabūr, wie Allah, der Erhabene, sagt:</w:t>
       </w:r>
       <w:r>
         <w:t xml:space="preserve"> </w:t>
@@ -8975,7 +8975,7 @@
         <w:t xml:space="preserve"> </w:t>
       </w:r>
       <w:r>
-        <w:t xml:space="preserve">[an-Nisāʾ: 163]. Und die Blätter Ibrāhīms und Mūsās (Ṣuḥuf Ibrāhīm wa-Mūsā), wie Allah, der Erhabene, sagt:</w:t>
+        <w:t xml:space="preserve">„Und Wir gaben Dāwūd einen Zabūr (Psalter)" [an-Nisāʾ: 163]. Und die Blätter Ibrāhīms und Mūsās (Ṣuḥuf Ibrāhīm wa-Mūsā), wie Allah, der Erhabene, sagt:</w:t>
       </w:r>
       <w:r>
         <w:t xml:space="preserve"> </w:t>
@@ -8991,7 +8991,7 @@
         <w:t xml:space="preserve"> </w:t>
       </w:r>
       <w:r>
-        <w:t xml:space="preserve">[al-Aʿlā: 19].</w:t>
+        <w:t xml:space="preserve">„die Blätter Ibrāhīms und Mūsās" [al-Aʿlā: 19].</w:t>
       </w:r>
     </w:p>
     <w:p>
@@ -9088,7 +9088,7 @@
         <w:t xml:space="preserve"> </w:t>
       </w:r>
       <w:r>
-        <w:t xml:space="preserve">[al-Baqarah: 91].</w:t>
+        <w:t xml:space="preserve">„Und wenn zu ihnen gesagt wird: Glaubt an das, was Allah herabgesandt hat, sagen sie: Wir glauben an das, was auf uns herabgesandt wurde, und verleugnen das, was danach kam, obwohl es die Wahrheit ist, das bestätigend, was ihnen vorliegt" [al-Baqarah: 91].</w:t>
       </w:r>
     </w:p>
     <w:p>
@@ -9122,7 +9122,7 @@
         <w:t xml:space="preserve"> </w:t>
       </w:r>
       <w:r>
-        <w:t xml:space="preserve">[an-Nisāʾ: 61]. Und Allah</w:t>
+        <w:t xml:space="preserve">„Und wenn zu ihnen gesagt wird: Kommt her zu dem, was Allah herabgesandt hat, und zum Gesandten, siehst du die Heuchler sich entschieden von dir abwenden" [an-Nisāʾ: 61]. Und Allah</w:t>
       </w:r>
       <w:r>
         <w:t xml:space="preserve"> </w:t>
@@ -9150,7 +9150,7 @@
         <w:t xml:space="preserve"> </w:t>
       </w:r>
       <w:r>
-        <w:t xml:space="preserve">[an-Nūr: 47].</w:t>
+        <w:t xml:space="preserve">„Und sie sagen: Wir glauben an Allah und an den Gesandten und gehorchen. Hierauf, nach diesem, kehrt sich eine Gruppe von ihnen ab; jene sind nicht die Gläubigen" [an-Nūr: 47].</w:t>
       </w:r>
     </w:p>
     <w:p>
@@ -9193,7 +9193,7 @@
         <w:t xml:space="preserve"> </w:t>
       </w:r>
       <w:r>
-        <w:t xml:space="preserve">[al-Ḥiǧr: 9]. Und Er</w:t>
+        <w:t xml:space="preserve">„Wahrlich, Wir sind es, die Wir die Ermahnung (den Qurʾān) herabgesandt haben, und Wir werden wahrlich ihr Hüter sein" [al-Ḥiǧr: 9]. Und Er</w:t>
       </w:r>
       <w:r>
         <w:t xml:space="preserve"> </w:t>
@@ -9221,7 +9221,7 @@
         <w:t xml:space="preserve"> </w:t>
       </w:r>
       <w:r>
-        <w:t xml:space="preserve">[Fuṣṣilat: 42]. Wer also glaubt, der Qurʾān sei verfälscht oder unvollständig, ist mit einem der Nullifiers des Glaubens an die Bücher gekommen.</w:t>
+        <w:t xml:space="preserve">„Das Falsche kommt weder von vorn noch von hinten an ihn heran – eine Herabsendung von einem Allweisen, Lobenswürdigen" [Fuṣṣilat: 42]. Wer also glaubt, der Qurʾān sei verfälscht oder unvollständig, ist mit einem der Nullifiers des Glaubens an die Bücher gekommen.</w:t>
       </w:r>
     </w:p>
     <w:p>
@@ -9305,7 +9305,7 @@
         <w:t xml:space="preserve"> </w:t>
       </w:r>
       <w:r>
-        <w:t xml:space="preserve">[al-Isrāʾ: 106]. Was die früheren Bücher angeht, so wurden sie auf einmal herabgesandt; Allah, der Erhabene, sagt:</w:t>
+        <w:t xml:space="preserve">„Und einen Qurʾān haben Wir in Abschnitte geteilt, damit du ihn den Menschen in Abständen vorträgst; und Wir sandten ihn nach und nach herab" [al-Isrāʾ: 106]. Was die früheren Bücher angeht, so wurden sie auf einmal herabgesandt; Allah, der Erhabene, sagt:</w:t>
       </w:r>
       <w:r>
         <w:t xml:space="preserve"> </w:t>
@@ -9334,7 +9334,7 @@
         <w:t xml:space="preserve"> </w:t>
       </w:r>
       <w:r>
-        <w:t xml:space="preserve">[al-Furqān: 32].</w:t>
+        <w:t xml:space="preserve">„So (geschieht es), damit Wir dein Herz damit festigen; und Wir haben ihn wohlgeordnet vorgetragen" [al-Furqān: 32].</w:t>
       </w:r>
     </w:p>
     <w:p>
@@ -9401,7 +9401,7 @@
         <w:t xml:space="preserve"> </w:t>
       </w:r>
       <w:r>
-        <w:t xml:space="preserve">[al-Furqān: 1]; während die Wunder der Propheten vergangen und zu Ende gegangen sind – im Gegensatz zum Qurʾān.</w:t>
+        <w:t xml:space="preserve">„Segensreich ist Der, der Seinem Diener die Unterscheidung (al-Furqān) herabgesandt hat, damit er den Weltenbewohnern ein Warner sei" [al-Furqān: 1]; während die Wunder der Propheten vergangen und zu Ende gegangen sind – im Gegensatz zum Qurʾān.</w:t>
       </w:r>
     </w:p>
     <w:p>
@@ -9435,7 +9435,7 @@
         <w:t xml:space="preserve"> </w:t>
       </w:r>
       <w:r>
-        <w:t xml:space="preserve">[al-Māʾidah: 48]. Und zu seinem „Wächter-Sein" gehört: dass er die früheren Bücher abrogiert hat, sodass nur nach dem Buch Allahs</w:t>
+        <w:t xml:space="preserve">„Und Wir haben zu dir das Buch mit der Wahrheit herabgesandt, das bestätigend, was von dem Buch vor ihm war, und als Wächter darüber" [al-Māʾidah: 48]. Und zu seinem „Wächter-Sein" gehört: dass er die früheren Bücher abrogiert hat, sodass nur nach dem Buch Allahs</w:t>
       </w:r>
       <w:r>
         <w:t xml:space="preserve"> </w:t>
@@ -9493,7 +9493,7 @@
         <w:t xml:space="preserve"> </w:t>
       </w:r>
       <w:r>
-        <w:t xml:space="preserve">[Fuṣṣilat: 42]; denn derjenige, der die Bewahrung des Qurʾān übernommen hat, ist Allah</w:t>
+        <w:t xml:space="preserve">„Das Falsche kommt weder von vorn noch von hinten an ihn heran – eine Herabsendung von einem Allweisen, Lobenswürdigen" [Fuṣṣilat: 42]; denn derjenige, der die Bewahrung des Qurʾān übernommen hat, ist Allah</w:t>
       </w:r>
       <w:r>
         <w:t xml:space="preserve"> </w:t>
@@ -9533,7 +9533,7 @@
         <w:t xml:space="preserve"> </w:t>
       </w:r>
       <w:r>
-        <w:t xml:space="preserve">[al-Ḥiǧr: 9]. Die früheren Bücher hingegen wurden von der Verfälschung (taḥrīf) erfasst; denn Allah</w:t>
+        <w:t xml:space="preserve">„Wahrlich, Wir sind es, die Wir die Ermahnung herabgesandt haben, und Wir werden wahrlich ihr Hüter sein" [al-Ḥiǧr: 9]. Die früheren Bücher hingegen wurden von der Verfälschung (taḥrīf) erfasst; denn Allah</w:t>
       </w:r>
       <w:r>
         <w:t xml:space="preserve"> </w:t>
@@ -9561,7 +9561,7 @@
         <w:t xml:space="preserve"> </w:t>
       </w:r>
       <w:r>
-        <w:t xml:space="preserve">[al-Māʾidah: 44].</w:t>
+        <w:t xml:space="preserve">„Wahrlich, Wir sandten die Tawrāh herab, in der Rechtleitung und Licht sind; nach ihr richteten die Propheten, die sich (Allah) ergeben hatten, für die Juden, ebenso die Gottesgelehrten und die Rabbiner, gemäß dem, was ihnen vom Buch Allahs anvertraut worden war und dessen Zeugen sie waren" [al-Māʾidah: 44].</w:t>
       </w:r>
     </w:p>
     <w:p>
@@ -9821,7 +9821,7 @@
         <w:t xml:space="preserve"> </w:t>
       </w:r>
       <w:r>
-        <w:t xml:space="preserve">[an-Nisāʾ: 152]; „rusul" ist hier ein Plural in der Iḍāfah-Konstruktion, und der Plural in der Iḍāfah drückt Allgemeinheit aus – das heißt: Sie glaubten an Allah und alle Seine Gesandten. Dies ist ein Maß, mit dem der Diener notwendigerweise kommen muss.</w:t>
+        <w:t xml:space="preserve">„Und diejenigen, die an Allah und Seine Gesandten glauben und zwischen keinem von ihnen einen Unterschied machen – jenen wird Er ihren Lohn geben. Und Allah ist Allvergebend, Barmherzig" [an-Nisāʾ: 152]; „rusul" ist hier ein Plural in der Iḍāfah-Konstruktion, und der Plural in der Iḍāfah drückt Allgemeinheit aus – das heißt: Sie glaubten an Allah und alle Seine Gesandten. Dies ist ein Maß, mit dem der Diener notwendigerweise kommen muss.</w:t>
       </w:r>
     </w:p>
     <w:p>
@@ -10059,7 +10059,7 @@
         <w:t xml:space="preserve"> </w:t>
       </w:r>
       <w:r>
-        <w:t xml:space="preserve">[an-Nisāʾ: 150-151]; wer also zwischen den Gesandten im Glauben trennt, ist ein Ungläubiger.</w:t>
+        <w:t xml:space="preserve">„Diejenigen, die Allah und Seine Gesandten verleugnen und zwischen Allah und Seinen Gesandten einen Unterschied machen wollen und sagen: Wir glauben an einige und verleugnen andere, und dazwischen einen Weg einschlagen wollen – das sind die wahren Ungläubigen. Und für die Ungläubigen haben Wir eine schmachvolle Strafe bereitet" [an-Nisāʾ: 150-151]; wer also zwischen den Gesandten im Glauben trennt, ist ein Ungläubiger.</w:t>
       </w:r>
     </w:p>
     <w:p>
@@ -10121,7 +10121,7 @@
         <w:t xml:space="preserve"> </w:t>
       </w:r>
       <w:r>
-        <w:t xml:space="preserve">[an-Nūr: 47].</w:t>
+        <w:t xml:space="preserve">„Und sie sagen: Wir glauben an Allah und an den Gesandten und gehorchen. Hierauf, nach diesem, kehrt sich eine Gruppe von ihnen ab; jene sind nicht die Gläubigen" [an-Nūr: 47].</w:t>
       </w:r>
     </w:p>
     <w:p>
@@ -10167,7 +10167,7 @@
         <w:t xml:space="preserve"> </w:t>
       </w:r>
       <w:r>
-        <w:t xml:space="preserve">[al-Māʾidah: 17] – Allah</w:t>
+        <w:t xml:space="preserve">„Fürwahr, ungläubig sind diejenigen, die sagen: Allah ist der Messias, der Sohn Maryams. Sag: Wer vermöchte gegen Allah etwas (auszurichten), wenn Er den Messias, den Sohn Maryams, seine Mutter und alle, die auf der Erde sind, vernichten wollte?" [al-Māʾidah: 17] – Allah</w:t>
       </w:r>
       <w:r>
         <w:t xml:space="preserve"> </w:t>
@@ -10207,7 +10207,7 @@
         <w:t xml:space="preserve"> </w:t>
       </w:r>
       <w:r>
-        <w:t xml:space="preserve">[al-Māʾidah: 75] – wer also Speise isst, dem darf keine Anbetung zugewendet werden, wegen seiner Bedürftigkeit. Und Er</w:t>
+        <w:t xml:space="preserve">„Der Messias, der Sohn Maryams, ist nur ein Gesandter, vor dem bereits Gesandte dahingegangen sind. Und seine Mutter war eine Wahrhaftige; beide pflegten Speise zu essen. Schau, wie Wir ihnen die Zeichen klarmachen, und dann schau, wie sie sich abwenden lassen" [al-Māʾidah: 75] – wer also Speise isst, dem darf keine Anbetung zugewendet werden, wegen seiner Bedürftigkeit. Und Er</w:t>
       </w:r>
       <w:r>
         <w:t xml:space="preserve"> </w:t>
@@ -10235,7 +10235,7 @@
         <w:t xml:space="preserve"> </w:t>
       </w:r>
       <w:r>
-        <w:t xml:space="preserve">[al-Furqān: 20]. Und Allah befahl den Gesandten zu sagen:</w:t>
+        <w:t xml:space="preserve">„Und Wir sandten vor dir keine Gesandten, ohne dass sie Speise aßen und auf den Märkten umhergingen" [al-Furqān: 20]. Und Allah befahl den Gesandten zu sagen:</w:t>
       </w:r>
       <w:r>
         <w:t xml:space="preserve"> </w:t>
@@ -10251,7 +10251,7 @@
         <w:t xml:space="preserve"> </w:t>
       </w:r>
       <w:r>
-        <w:t xml:space="preserve">[al-Kahf: 110]; sie sind also Menschen, die Allah</w:t>
+        <w:t xml:space="preserve">„Ich bin nur ein Mensch wie ihr; mir wird (als Offenbarung) eingegeben, dass euer Gott nur ein einziger Gott ist" [al-Kahf: 110]; sie sind also Menschen, die Allah</w:t>
       </w:r>
       <w:r>
         <w:t xml:space="preserve"> </w:t>
@@ -10306,7 +10306,7 @@
         <w:t xml:space="preserve"> </w:t>
       </w:r>
       <w:r>
-        <w:t xml:space="preserve">[an-Naml: 65]; und Sein Wort:</w:t>
+        <w:t xml:space="preserve">„Sag: Niemand in den Himmeln und auf der Erde kennt das Verborgene außer Allah; und sie merken nicht, wann sie auferweckt werden" [an-Naml: 65]; und Sein Wort:</w:t>
       </w:r>
       <w:r>
         <w:t xml:space="preserve"> </w:t>
@@ -10322,7 +10322,7 @@
         <w:t xml:space="preserve"> </w:t>
       </w:r>
       <w:r>
-        <w:t xml:space="preserve">[al-Aʿrāf: 188]. Das belegt, dass die Propheten das Verborgene nicht kennen; wer glaubt, sie kennten das Verborgene, hat seinen Glauben an die Gesandten zunichtegemacht.</w:t>
+        <w:t xml:space="preserve">„Sag: Ich vermag mir selbst weder Nutzen noch Schaden (zu verschaffen), außer was Allah will. Wenn ich das Verborgene kennte, würde ich mir viel Gutes verschaffen, und Übles würde mir nicht widerfahren. Ich bin nur ein Warner und ein Freudenbote für Leute, die glauben" [al-Aʿrāf: 188]. Das belegt, dass die Propheten das Verborgene nicht kennen; wer glaubt, sie kennten das Verborgene, hat seinen Glauben an die Gesandten zunichtegemacht.</w:t>
       </w:r>
     </w:p>
     <w:p>
@@ -10368,7 +10368,7 @@
         <w:t xml:space="preserve"> </w:t>
       </w:r>
       <w:r>
-        <w:t xml:space="preserve">[al-Aḥzāb: 57].</w:t>
+        <w:t xml:space="preserve">„Wahrlich, diejenigen, die Allah und Seinen Gesandten Leid zufügen – Allah verflucht sie im Diesseits und Jenseits, und Er hat für sie eine schmachvolle Strafe bereitet" [al-Aḥzāb: 57].</w:t>
       </w:r>
     </w:p>
     <w:bookmarkEnd w:id="55"/>
@@ -10420,7 +10420,7 @@
         <w:t xml:space="preserve"> </w:t>
       </w:r>
       <w:r>
-        <w:t xml:space="preserve">[al-Kahf: 110]; er ist also ein Mensch, doch zeichnete er sich durch die Offenbarung aus.</w:t>
+        <w:t xml:space="preserve">„Sag: Ich bin nur ein Mensch wie ihr; mir wird (als Offenbarung) eingegeben, dass euer Gott nur ein einziger Gott ist" [al-Kahf: 110]; er ist also ein Mensch, doch zeichnete er sich durch die Offenbarung aus.</w:t>
       </w:r>
     </w:p>
     <w:p>
@@ -10478,7 +10478,7 @@
         <w:t xml:space="preserve"> </w:t>
       </w:r>
       <w:r>
-        <w:t xml:space="preserve">[an-Nisāʾ: 80]; Allah machte also den Gehorsam gegenüber dem Gesandten zur Pflicht – wäre er nicht unfehlbar, wäre der Gehorsam ihm gegenüber nicht zur Pflicht gemacht worden.</w:t>
+        <w:t xml:space="preserve">„Wer dem Gesandten gehorcht, der gehorcht (damit) Allah" [an-Nisāʾ: 80]; Allah machte also den Gehorsam gegenüber dem Gesandten zur Pflicht – wäre er nicht unfehlbar, wäre der Gehorsam ihm gegenüber nicht zur Pflicht gemacht worden.</w:t>
       </w:r>
     </w:p>
     <w:p>
@@ -10833,7 +10833,7 @@
         <w:t xml:space="preserve"> </w:t>
       </w:r>
       <w:r>
-        <w:t xml:space="preserve">[al-Baqarah: 253]. Und der Beweis, dass er der beste der Propheten ist – Allahs Segnungen und Heil seien auf ihm –, ist sein Wort:</w:t>
+        <w:t xml:space="preserve">„Das sind die Gesandten; Wir haben die einen von ihnen vor den anderen bevorzugt" [al-Baqarah: 253]. Und der Beweis, dass er der beste der Propheten ist – Allahs Segnungen und Heil seien auf ihm –, ist sein Wort:</w:t>
       </w:r>
       <w:r>
         <w:t xml:space="preserve"> </w:t>
@@ -10906,7 +10906,7 @@
         <w:t xml:space="preserve"> </w:t>
       </w:r>
       <w:r>
-        <w:t xml:space="preserve">[Sabaʾ: 28]. Und Er, der Erhabene, sagt:</w:t>
+        <w:t xml:space="preserve">„Und Wir haben dich nur als Bringer froher Botschaft und als Warner für alle Menschen gesandt; aber die meisten Menschen wissen nicht" [Sabaʾ: 28]. Und Er, der Erhabene, sagt:</w:t>
       </w:r>
       <w:r>
         <w:t xml:space="preserve"> </w:t>
@@ -10922,7 +10922,7 @@
         <w:t xml:space="preserve"> </w:t>
       </w:r>
       <w:r>
-        <w:t xml:space="preserve">[al-Aḥqāf: 29-32]. Was die übrigen Propheten angeht, so wurden sie zu ihren Völkern besonders (ḫāṣṣatan) gesandt.</w:t>
+        <w:t xml:space="preserve">„Und (gedenke,) als Wir eine kleine Schar Dschinn zu dir lenkten, die dem Qurʾān zuhörten. Als sie ihm beiwohnten, sagten sie: Seid still! Als er dann zu Ende war, kehrten sie zu ihrem Volk zurück, um zu warnen. Sie sagten: O unser Volk, wir haben ein Buch gehört, das nach Mūsā herabgesandt wurde, das bestätigend, was vor ihm war, und das zur Wahrheit und zu einem geraden Weg leitet. O unser Volk, erhört den Rufer Allahs und glaubt an ihn, so vergibt Er euch (etwas) von euren Sünden und schützt euch vor einer schmerzhaften Strafe. Und wer den Rufer Allahs nicht erhört, kann sich (Ihm) auf der Erde nicht entziehen, und er hat außer Ihm keine Beschützer. Jene befinden sich in deutlichem Irrtum" [al-Aḥqāf: 29-32]. Was die übrigen Propheten angeht, so wurden sie zu ihren Völkern besonders (ḫāṣṣatan) gesandt.</w:t>
       </w:r>
     </w:p>
     <w:p>
@@ -10956,7 +10956,7 @@
         <w:t xml:space="preserve"> </w:t>
       </w:r>
       <w:r>
-        <w:t xml:space="preserve">[al-Isrāʾ: 79]; und dies ist „al-Maqām al-Maḥmūd" (die lobenswerte Stätte) – es ist die Fürsprache.</w:t>
+        <w:t xml:space="preserve">„Vielleicht wird dein Herr dich zu einer lobenswerten Stätte erwecken" [al-Isrāʾ: 79]; und dies ist „al-Maqām al-Maḥmūd" (die lobenswerte Stätte) – es ist die Fürsprache.</w:t>
       </w:r>
     </w:p>
     <w:p>
@@ -11056,7 +11056,7 @@
         <w:t xml:space="preserve"> </w:t>
       </w:r>
       <w:r>
-        <w:t xml:space="preserve">[al-Aḥzāb: 40]; es gibt also keinen Propheten nach unserem Propheten</w:t>
+        <w:t xml:space="preserve">„Muḥammad ist nicht der Vater irgendeines eurer Männer, sondern der Gesandte Allahs und das Siegel der Propheten. Und Allah ist über alles Wissend" [al-Aḥzāb: 40]; es gibt also keinen Propheten nach unserem Propheten</w:t>
       </w:r>
       <w:r>
         <w:t xml:space="preserve"> </w:t>
@@ -11266,7 +11266,7 @@
         <w:t xml:space="preserve"> </w:t>
       </w:r>
       <w:r>
-        <w:t xml:space="preserve">[al-Ǧāṯiyah: 34]. Allah</w:t>
+        <w:t xml:space="preserve">„Und es wird gesagt: Heute vergessen Wir euch, so wie ihr die Begegnung mit diesem eurem Tag vergessen habt; und eure Zuflucht ist das Feuer, und ihr habt keine Helfer" [al-Ǧāṯiyah: 34]. Allah</w:t>
       </w:r>
       <w:r>
         <w:t xml:space="preserve"> </w:t>
@@ -11567,7 +11567,7 @@
         <w:t xml:space="preserve"> </w:t>
       </w:r>
       <w:r>
-        <w:t xml:space="preserve">[Ġāfir: 45-46]. Die Leute Firʿawns werden also dem Feuer vorgeführt, bevor die Stunde anbricht – das heißt: im Barzaḫ-Leben.</w:t>
+        <w:t xml:space="preserve">„Und die Leute Firʿawns umschloss die böse Strafe: das Feuer, dem sie morgens und abends vorgeführt werden. Und am Tag, da die Stunde anbricht (, wird gesagt): Lasst die Leute Firʿawns in die härteste Strafe eingehen!" [Ġāfir: 45-46]. Die Leute Firʿawns werden also dem Feuer vorgeführt, bevor die Stunde anbricht – das heißt: im Barzaḫ-Leben.</w:t>
       </w:r>
     </w:p>
     <w:p>
@@ -11754,7 +11754,7 @@
         <w:t xml:space="preserve"> </w:t>
       </w:r>
       <w:r>
-        <w:t xml:space="preserve">[az-Zumar: 68].</w:t>
+        <w:t xml:space="preserve">„Und es wird ins Horn geblasen, und da fallen alle, die in den Himmeln und auf der Erde sind, tot nieder, außer wem Allah will. Hierauf wird ein weiteres Mal hineingeblasen, und da stehen sie sogleich auf und schauen" [az-Zumar: 68].</w:t>
       </w:r>
     </w:p>
     <w:p>
@@ -11852,7 +11852,7 @@
         <w:t xml:space="preserve"> </w:t>
       </w:r>
       <w:r>
-        <w:t xml:space="preserve">[at-Taġābun: 7]. Die Menschen werden auf dem auferweckt, worauf sie im Diesseits waren: Wer auf etwas lebte, stirbt darauf; und wer auf etwas starb, wird darauf auferweckt. Wer also auf Musik, Liedern und Serien lebte und darauf starb, wird darauf auferweckt. So obliegt es dem Menschen, sich zu hüten und sich dem Gehorsam gegenüber Allah</w:t>
+        <w:t xml:space="preserve">„Diejenigen, die ungläubig sind, behaupten, dass sie nicht auferweckt werden. Sag: Doch, bei meinem Herrn, ihr werdet ganz gewiss auferweckt werden; hierauf wird euch ganz gewiss kundgetan, was ihr getan habt. Und dies ist Allah ein Leichtes" [at-Taġābun: 7]. Die Menschen werden auf dem auferweckt, worauf sie im Diesseits waren: Wer auf etwas lebte, stirbt darauf; und wer auf etwas starb, wird darauf auferweckt. Wer also auf Musik, Liedern und Serien lebte und darauf starb, wird darauf auferweckt. So obliegt es dem Menschen, sich zu hüten und sich dem Gehorsam gegenüber Allah</w:t>
       </w:r>
       <w:r>
         <w:t xml:space="preserve"> </w:t>
@@ -11920,7 +11920,7 @@
         <w:t xml:space="preserve"> </w:t>
       </w:r>
       <w:r>
-        <w:t xml:space="preserve">[al-Isrāʾ: 97] – wir suchen Zuflucht bei Allah vor dem Im-Stich-gelassen-Werden.</w:t>
+        <w:t xml:space="preserve">„Und Wir versammeln sie am Tag der Auferstehung auf ihren Gesichtern, blind, stumm und taub; ihre Zuflucht ist die Hölle. Jedes Mal, wenn sie schwächer wird, mehren Wir ihnen die Feuerglut" [al-Isrāʾ: 97] – wir suchen Zuflucht bei Allah vor dem Im-Stich-gelassen-Werden.</w:t>
       </w:r>
     </w:p>
     <w:p>
@@ -11958,7 +11958,7 @@
         <w:t xml:space="preserve"> </w:t>
       </w:r>
       <w:r>
-        <w:t xml:space="preserve">[Maryam: 85] – Glückwunsch also den Leuten des Glaubens.</w:t>
+        <w:t xml:space="preserve">„Am Tag, da Wir die Gottesfürchtigen als (geehrte) Abordnung zum Allerbarmer versammeln" [Maryam: 85] – Glückwunsch also den Leuten des Glaubens.</w:t>
       </w:r>
     </w:p>
     <w:p>
@@ -11992,7 +11992,7 @@
         <w:t xml:space="preserve"> </w:t>
       </w:r>
       <w:r>
-        <w:t xml:space="preserve">[Ibrāhīm: 48]. Es ist eine weiße, ins Rötliche spielende, weite (Ebene) – die Plätze des Tages der Auferstehung –, in der es kein Wegzeichen gibt; die Menschen werden auf dieser Erde versammelt. Und diese Erde gehört zu der Ehre, die Allah den Leuten des Glaubens erweist; Er macht sie für sie wie das (weiche) Fladenbrot, von dem sie essen – und dies ist den Leuten des Glaubens eigen. Auch die Tiere und das Vieh werden versammelt, wie Allah, der Erhabene, sagt:</w:t>
+        <w:t xml:space="preserve">„Am Tag, da die Erde durch eine andere Erde ausgewechselt wird, und (auch) die Himmel; und sie vor Allah, den Einen, den Allbezwinger, hintreten" [Ibrāhīm: 48]. Es ist eine weiße, ins Rötliche spielende, weite (Ebene) – die Plätze des Tages der Auferstehung –, in der es kein Wegzeichen gibt; die Menschen werden auf dieser Erde versammelt. Und diese Erde gehört zu der Ehre, die Allah den Leuten des Glaubens erweist; Er macht sie für sie wie das (weiche) Fladenbrot, von dem sie essen – und dies ist den Leuten des Glaubens eigen. Auch die Tiere und das Vieh werden versammelt, wie Allah, der Erhabene, sagt:</w:t>
       </w:r>
       <w:r>
         <w:t xml:space="preserve"> </w:t>
@@ -12008,7 +12008,7 @@
         <w:t xml:space="preserve"> </w:t>
       </w:r>
       <w:r>
-        <w:t xml:space="preserve">[at-Takwīr: 5] – die ganze Schöpfung wird also zum Ort der Versammlung versammelt.</w:t>
+        <w:t xml:space="preserve">„und wenn die wilden Tiere versammelt werden" [at-Takwīr: 5] – die ganze Schöpfung wird also zum Ort der Versammlung versammelt.</w:t>
       </w:r>
     </w:p>
     <w:p>
@@ -12202,7 +12202,7 @@
         <w:t xml:space="preserve"> </w:t>
       </w:r>
       <w:r>
-        <w:t xml:space="preserve">[al-Ḥāqqah: 19-20]. Und sein Lohn ist:</w:t>
+        <w:t xml:space="preserve">„Nehmt, lest mein Buch! Ich habe ja damit gerechnet, dass ich meiner Abrechnung begegnen werde" [al-Ḥāqqah: 19-20]. Und sein Lohn ist:</w:t>
       </w:r>
       <w:r>
         <w:t xml:space="preserve"> </w:t>
@@ -12218,7 +12218,7 @@
         <w:t xml:space="preserve"> </w:t>
       </w:r>
       <w:r>
-        <w:t xml:space="preserve">[al-Ḥāqqah: 21-24].</w:t>
+        <w:t xml:space="preserve">„So wird er in einem zufriedenen Leben sein, in einem hoch gelegenen Garten, dessen Früchte nahe (erreichbar) sind. Esst und trinkt als wohlbekömmlich für das, was ihr in den vergangenen Tagen vorausgeschickt habt" [al-Ḥāqqah: 21-24].</w:t>
       </w:r>
     </w:p>
     <w:p>
@@ -12256,7 +12256,7 @@
         <w:t xml:space="preserve"> </w:t>
       </w:r>
       <w:r>
-        <w:t xml:space="preserve">[al-Ḥāqqah: 25-29]. Und sein Lohn ist:</w:t>
+        <w:t xml:space="preserve">„O wäre mir mein Buch doch nicht gegeben worden, und wüsste ich nicht, was meine Abrechnung ist! O wäre sie (der Tod) doch das Ende gewesen! Mein Besitz hat mir nichts genützt, dahingeschwunden ist meine Macht" [al-Ḥāqqah: 25-29]. Und sein Lohn ist:</w:t>
       </w:r>
       <w:r>
         <w:t xml:space="preserve"> </w:t>
@@ -12272,7 +12272,7 @@
         <w:t xml:space="preserve"> </w:t>
       </w:r>
       <w:r>
-        <w:t xml:space="preserve">[al-Ḥāqqah: 30-32] – bis zum Ende der Verse.</w:t>
+        <w:t xml:space="preserve">„Ergreift ihn und fesselt ihn, hierauf setzt ihn dem Höllenbrand aus, hierauf steckt ihn in eine Kette, deren Länge siebzig Ellen ist" [al-Ḥāqqah: 30-32] – bis zum Ende der Verse.</w:t>
       </w:r>
     </w:p>
     <w:bookmarkEnd w:id="63"/>
@@ -12616,7 +12616,7 @@
         <w:t xml:space="preserve"> </w:t>
       </w:r>
       <w:r>
-        <w:t xml:space="preserve">[al-Aʿrāf: 8-9].</w:t>
+        <w:t xml:space="preserve">„Das Wägen erfolgt an jenem Tag der Wahrheit (entsprechend). Wessen Waagschalen schwer sind, das sind die Erfolgreichen. Wessen Waagschalen aber leicht sind, das sind diejenigen, die ihre Seelen verloren haben dafür, dass sie an Unseren Zeichen Unrecht zu tun pflegten" [al-Aʿrāf: 8-9].</w:t>
       </w:r>
     </w:p>
     <w:bookmarkEnd w:id="65"/>
@@ -12767,7 +12767,7 @@
         <w:t xml:space="preserve"> </w:t>
       </w:r>
       <w:r>
-        <w:t xml:space="preserve">[al-Ḥiǧr: 47]. Wer über den Übergang hinübergelangt, tritt ins Paradies ein; und wer von der Brücke fällt, ist im Feuer.</w:t>
+        <w:t xml:space="preserve">„Und Wir nehmen weg, was in ihren Herzen an Groll ist – als Brüder (liegen sie) auf Ruhebetten einander gegenüber" [al-Ḥiǧr: 47]. Wer über den Übergang hinübergelangt, tritt ins Paradies ein; und wer von der Brücke fällt, ist im Feuer.</w:t>
       </w:r>
     </w:p>
     <w:bookmarkEnd w:id="68"/>
@@ -12848,7 +12848,7 @@
         <w:t xml:space="preserve"> </w:t>
       </w:r>
       <w:r>
-        <w:t xml:space="preserve">[al-Qiyāmah: 22-23]. Dieses Paradies betreten nur Seine Schutzbefohlenen – jene, die über die Brücke hinübergelangten.</w:t>
+        <w:t xml:space="preserve">„(Manche) Gesichter werden an jenem Tag strahlend sein, zu ihrem Herrn schauend" [al-Qiyāmah: 22-23]. Dieses Paradies betreten nur Seine Schutzbefohlenen – jene, die über die Brücke hinübergelangten.</w:t>
       </w:r>
     </w:p>
     <w:p>
@@ -12928,7 +12928,7 @@
         <w:t xml:space="preserve"> </w:t>
       </w:r>
       <w:r>
-        <w:t xml:space="preserve">[Āl ʿImrān: 133], und über die Hölle:</w:t>
+        <w:t xml:space="preserve">„Und beeilt euch um Vergebung von eurem Herrn und (um) einen (Paradies-)Garten, dessen Breite (die) der Himmel und der Erde ist, bereitet für die Gottesfürchtigen" [Āl ʿImrān: 133], und über die Hölle:</w:t>
       </w:r>
       <w:r>
         <w:t xml:space="preserve"> </w:t>
@@ -12944,7 +12944,7 @@
         <w:t xml:space="preserve"> </w:t>
       </w:r>
       <w:r>
-        <w:t xml:space="preserve">[Āl ʿImrān: 131] – das heißt: dass sie schon bereitet und fertiggestellt sind.</w:t>
+        <w:t xml:space="preserve">„Und hütet euch vor dem Feuer, das für die Ungläubigen bereitet ist" [Āl ʿImrān: 131] – das heißt: dass sie schon bereitet und fertiggestellt sind.</w:t>
       </w:r>
     </w:p>
     <w:p>
@@ -12982,7 +12982,7 @@
         <w:t xml:space="preserve"> </w:t>
       </w:r>
       <w:r>
-        <w:t xml:space="preserve">[an-Nisāʾ: 57]. Und Er, der Erhabene, sagt (über die Früchte des Paradieses):</w:t>
+        <w:t xml:space="preserve">„Und diejenigen, die glauben und rechtschaffene Werke tun, werden Wir in Gärten eingehen lassen, durcheilt von Bächen, ewig und auf immer darin zu bleiben; darin haben sie gereinigte Gattinnen; und Wir lassen sie in beständigen Schatten eingehen" [an-Nisāʾ: 57]. Und Er, der Erhabene, sagt (über die Früchte des Paradieses):</w:t>
       </w:r>
       <w:r>
         <w:t xml:space="preserve"> </w:t>
@@ -12998,7 +12998,7 @@
         <w:t xml:space="preserve"> </w:t>
       </w:r>
       <w:r>
-        <w:t xml:space="preserve">[al-Wāqiʿah: 33]. Und Er, der Erhabene, sagt (über die Leute des Feuers):</w:t>
+        <w:t xml:space="preserve">„die weder aufhören noch verwehrt sind" [al-Wāqiʿah: 33]. Und Er, der Erhabene, sagt (über die Leute des Feuers):</w:t>
       </w:r>
       <w:r>
         <w:t xml:space="preserve"> </w:t>
@@ -13014,7 +13014,7 @@
         <w:t xml:space="preserve"> </w:t>
       </w:r>
       <w:r>
-        <w:t xml:space="preserve">[al-Baqarah: 167].</w:t>
+        <w:t xml:space="preserve">„und sie werden das Feuer nicht verlassen" [al-Baqarah: 167].</w:t>
       </w:r>
     </w:p>
     <w:bookmarkEnd w:id="69"/>
@@ -13071,7 +13071,7 @@
         <w:t xml:space="preserve"> </w:t>
       </w:r>
       <w:r>
-        <w:t xml:space="preserve">[al-Muṭaffifīn: 10-12]; Allah</w:t>
+        <w:t xml:space="preserve">„Wehe an jenem Tag den Leugnern, die den Tag des Gerichts für Lüge erklären! Und nur jeder maßlose Sünder erklärt ihn für Lüge" [al-Muṭaffifīn: 10-12]; Allah</w:t>
       </w:r>
       <w:r>
         <w:t xml:space="preserve"> </w:t>
@@ -13099,7 +13099,7 @@
         <w:t xml:space="preserve"> </w:t>
       </w:r>
       <w:r>
-        <w:t xml:space="preserve">[al-Ǧāṯiyah: 34]; wer also die Begegnung mit Allah</w:t>
+        <w:t xml:space="preserve">„Und es wird gesagt: Heute vergessen Wir euch, so wie ihr die Begegnung mit diesem eurem Tag vergessen habt" [al-Ǧāṯiyah: 34]; wer also die Begegnung mit Allah</w:t>
       </w:r>
       <w:r>
         <w:t xml:space="preserve"> </w:t>
@@ -13512,7 +13512,7 @@
         <w:t xml:space="preserve"> </w:t>
       </w:r>
       <w:r>
-        <w:t xml:space="preserve">[Ṭāhā: 98]. Er weiß, was war – das heißt: in der Vergangenheit –, und was sein wird – das heißt: in der Zukunft –, und was nicht war: wie es wäre, wenn es gewesen wäre; das Nicht-Geschehene weiß Er, wie es bestimmt wäre, wenn es existiert hätte, wie Allah, der Erhabene, sagt:</w:t>
+        <w:t xml:space="preserve">„Er umfasst alles mit (Seinem) Wissen" [Ṭāhā: 98]. Er weiß, was war – das heißt: in der Vergangenheit –, und was sein wird – das heißt: in der Zukunft –, und was nicht war: wie es wäre, wenn es gewesen wäre; das Nicht-Geschehene weiß Er, wie es bestimmt wäre, wenn es existiert hätte, wie Allah, der Erhabene, sagt:</w:t>
       </w:r>
       <w:r>
         <w:t xml:space="preserve"> </w:t>
@@ -13528,7 +13528,7 @@
         <w:t xml:space="preserve"> </w:t>
       </w:r>
       <w:r>
-        <w:t xml:space="preserve">[al-Anfāl: 22-23]. Es ist also nicht möglich, dass etwas geschieht, das dem Qadar zuwiderläuft; denn der Qadar ist mit dem ewigen Wissen Allahs verbunden, und Allah – Ihm bleibt nichts verborgen.</w:t>
+        <w:t xml:space="preserve">„Die schlimmsten Tiere (Geschöpfe) bei Allah sind die Tauben und Stummen, die nicht begreifen. Und wenn Allah an ihnen etwas Gutes gekannt hätte, hätte Er sie wahrlich hören lassen; und (selbst) wenn Er sie hätte hören lassen, hätten sie sich abgewandt und wären widerstrebend geblieben" [al-Anfāl: 22-23]. Es ist also nicht möglich, dass etwas geschieht, das dem Qadar zuwiderläuft; denn der Qadar ist mit dem ewigen Wissen Allahs verbunden, und Allah – Ihm bleibt nichts verborgen.</w:t>
       </w:r>
     </w:p>
     <w:p>
@@ -13648,7 +13648,7 @@
         <w:t xml:space="preserve"> </w:t>
       </w:r>
       <w:r>
-        <w:t xml:space="preserve">[Yāsīn: 12].</w:t>
+        <w:t xml:space="preserve">„Wahrlich, Wir sind es, die Wir die Toten wieder lebendig machen. Und Wir schreiben auf, was sie vorausgeschickt haben und (auch) ihre Spuren. Und alle Dinge haben Wir in einem deutlichen Verzeichnis erfasst" [Yāsīn: 12].</w:t>
       </w:r>
     </w:p>
     <w:p>
@@ -13747,7 +13747,7 @@
         <w:t xml:space="preserve"> </w:t>
       </w:r>
       <w:r>
-        <w:t xml:space="preserve">[al-Insān: 30].</w:t>
+        <w:t xml:space="preserve">„Und ihr wollt nicht, außer dass Allah will" [al-Insān: 30].</w:t>
       </w:r>
     </w:p>
     <w:p>
@@ -13793,7 +13793,7 @@
         <w:t xml:space="preserve"> </w:t>
       </w:r>
       <w:r>
-        <w:t xml:space="preserve">[az-Zumar: 62]. Der Diener und seine Handlung fallen unter die Erschaffung Allahs</w:t>
+        <w:t xml:space="preserve">„Allah ist der Schöpfer aller Dinge" [az-Zumar: 62]. Der Diener und seine Handlung fallen unter die Erschaffung Allahs</w:t>
       </w:r>
       <w:r>
         <w:t xml:space="preserve"> </w:t>
@@ -14126,7 +14126,7 @@
         <w:t xml:space="preserve"> </w:t>
       </w:r>
       <w:r>
-        <w:t xml:space="preserve">[al-Ḥuǧurāt: 15]. Er machte den Īmān vom Verneinen des Zweifels (raib) abhängig, und das Verneinen des Zweifels ist Sache des Herzens; das belegt, dass mit dem Īmān hier gemeint ist: das Wort des Herzens.</w:t>
+        <w:t xml:space="preserve">„Die (wahren) Gläubigen sind nur diejenigen, die an Allah und Seinen Gesandten glauben und hierauf nicht zweifeln" [al-Ḥuǧurāt: 15]. Er machte den Īmān vom Verneinen des Zweifels (raib) abhängig, und das Verneinen des Zweifels ist Sache des Herzens; das belegt, dass mit dem Īmān hier gemeint ist: das Wort des Herzens.</w:t>
       </w:r>
     </w:p>
     <w:p>
@@ -14169,7 +14169,7 @@
         <w:t xml:space="preserve"> </w:t>
       </w:r>
       <w:r>
-        <w:t xml:space="preserve">[al-Baqarah: 136]. Er bezeichnete den Islam mit Seinem Wort</w:t>
+        <w:t xml:space="preserve">„Sagt: Wir glauben an Allah und an das, was zu uns herabgesandt wurde, und an das, was zu Ibrāhīm, Ismāʿīl, Isḥāq, Yaʿqūb und den Stämmen herabgesandt wurde, und (an das,) was Mūsā und ʿĪsā gegeben wurde, und (an das,) was den Propheten von ihrem Herrn gegeben wurde. Wir machen zwischen keinem von ihnen einen Unterschied, und Ihm sind wir ergeben" [al-Baqarah: 136]. Er bezeichnete den Islam mit Seinem Wort</w:t>
       </w:r>
       <w:r>
         <w:t xml:space="preserve"> </w:t>
@@ -14228,7 +14228,7 @@
         <w:t xml:space="preserve"> </w:t>
       </w:r>
       <w:r>
-        <w:t xml:space="preserve">[al-Anfāl: 2-4]. Das Beben (des Herzens, al-waǧal) gehört zu den Werken der Herzen, und Er nannte es „Īmān".</w:t>
+        <w:t xml:space="preserve">„Die (wahren) Gläubigen sind ja diejenigen, deren Herzen sich vor Ehrfurcht regen, wenn Allah genannt wird, und die, wenn ihnen Seine Zeichen verlesen werden, dadurch an Glauben zunehmen, und die sich auf ihren Herrn verlassen, die das Gebet verrichten und von dem, womit Wir sie versorgt haben, ausgeben. Das sind die wahren Gläubigen. Für sie sind Rangstufen bei ihrem Herrn (bestimmt) und Vergebung und ehrenvolle Versorgung" [al-Anfāl: 2-4]. Das Beben (des Herzens, al-waǧal) gehört zu den Werken der Herzen, und Er nannte es „Īmān".</w:t>
       </w:r>
     </w:p>
     <w:p>
@@ -14271,7 +14271,7 @@
         <w:t xml:space="preserve"> </w:t>
       </w:r>
       <w:r>
-        <w:t xml:space="preserve">[al-Baqarah: 143]. Mit Konsens (Iǧmāʿ) der Leute des Wissens ist mit dem „Īmān" hier gemeint: das Gebet (aṣ-ṣalāh); denn sie pflegten zum Jerusalemer Heiligtum (Bayt al-Maqdis) zu beten, dann wurde (die Gebetsrichtung) vom Bayt al-Maqdis abrogiert – da sagte Allah</w:t>
+        <w:t xml:space="preserve">„Und Allah würde euren Glauben (euer Gebet) nicht verlorengehen lassen" [al-Baqarah: 143]. Mit Konsens (Iǧmāʿ) der Leute des Wissens ist mit dem „Īmān" hier gemeint: das Gebet (aṣ-ṣalāh); denn sie pflegten zum Jerusalemer Heiligtum (Bayt al-Maqdis) zu beten, dann wurde (die Gebetsrichtung) vom Bayt al-Maqdis abrogiert – da sagte Allah</w:t>
       </w:r>
       <w:r>
         <w:t xml:space="preserve"> </w:t>
@@ -14452,7 +14452,7 @@
         <w:t xml:space="preserve"> </w:t>
       </w:r>
       <w:r>
-        <w:t xml:space="preserve">[Āl ʿImrān: 173]. Und Er, der Erhabene, sagt:</w:t>
+        <w:t xml:space="preserve">„Diejenigen, zu denen die Menschen sagten: Die Menschen haben (sich) bereits gegen euch versammelt, so fürchtet sie! Doch das mehrte (nur) ihren Glauben" [Āl ʿImrān: 173]. Und Er, der Erhabene, sagt:</w:t>
       </w:r>
       <w:r>
         <w:t xml:space="preserve"> </w:t>
@@ -14468,7 +14468,7 @@
         <w:t xml:space="preserve"> </w:t>
       </w:r>
       <w:r>
-        <w:t xml:space="preserve">[al-Muddaṯṯir: 31].</w:t>
+        <w:t xml:space="preserve">„und damit diejenigen, die glauben, an Glauben zunehmen" [al-Muddaṯṯir: 31].</w:t>
       </w:r>
     </w:p>
     <w:p>
@@ -14598,7 +14598,7 @@
         <w:t xml:space="preserve"> </w:t>
       </w:r>
       <w:r>
-        <w:t xml:space="preserve">[al-Māʾidah: 27].</w:t>
+        <w:t xml:space="preserve">„Allah nimmt nur von den Gottesfürchtigen an" [al-Māʾidah: 27].</w:t>
       </w:r>
     </w:p>
     <w:p>
@@ -14632,7 +14632,7 @@
         <w:t xml:space="preserve"> </w:t>
       </w:r>
       <w:r>
-        <w:t xml:space="preserve">[an-Naǧm: 32]. Dies baut darauf auf, dass mit dem Īmān die Vollkommenheit des pflichtgemäßen Īmān gemeint ist; denn wer für sich selbst bezeugt, dass er zur Vollkommenheit des Īmān gelangt ist, der hat sich selbst gelobt (gereinigt).</w:t>
+        <w:t xml:space="preserve">„So erklärt nicht euch selbst für lauter; Er weiß am besten, wer gottesfürchtig ist" [an-Naǧm: 32]. Dies baut darauf auf, dass mit dem Īmān die Vollkommenheit des pflichtgemäßen Īmān gemeint ist; denn wer für sich selbst bezeugt, dass er zur Vollkommenheit des Īmān gelangt ist, der hat sich selbst gelobt (gereinigt).</w:t>
       </w:r>
     </w:p>
     <w:p>
@@ -14888,7 +14888,7 @@
         <w:t xml:space="preserve"> </w:t>
       </w:r>
       <w:r>
-        <w:t xml:space="preserve">[al-Baqarah: 34]; denn er kannte Allah</w:t>
+        <w:t xml:space="preserve">„außer Iblīs; er weigerte sich und verhielt sich hochmütig und gehörte zu den Ungläubigen" [al-Baqarah: 34]; denn er kannte Allah</w:t>
       </w:r>
       <w:r>
         <w:t xml:space="preserve"> </w:t>
@@ -15194,7 +15194,7 @@
         <w:t xml:space="preserve"> </w:t>
       </w:r>
       <w:r>
-        <w:t xml:space="preserve">[an-Naḥl: 106]. So erfordert das absolute Für-ungläubig-Erklären nicht das Für-ungläubig-Erklären der bestimmten Person, außer nachdem die Bedingungen erfüllt und die Hinderungsgründe ausgeschlossen sind.</w:t>
+        <w:t xml:space="preserve">„Wer Allah verleugnet, nachdem er geglaubt hatte – außer demjenigen, der gezwungen wird, während sein Herz im Glauben Ruhe gefunden hat …" [an-Naḥl: 106]. So erfordert das absolute Für-ungläubig-Erklären nicht das Für-ungläubig-Erklären der bestimmten Person, außer nachdem die Bedingungen erfüllt und die Hinderungsgründe ausgeschlossen sind.</w:t>
       </w:r>
     </w:p>
     <w:bookmarkStart w:id="80" w:name="Xd7f75195a0d4e5474b87e9459c239eab691a308"/>
@@ -15237,7 +15237,7 @@
         <w:t xml:space="preserve"> </w:t>
       </w:r>
       <w:r>
-        <w:t xml:space="preserve">[al-Bayyinah: 6].</w:t>
+        <w:t xml:space="preserve">„Diejenigen unter den Leuten der Schrift und den Götzendienern, die ungläubig sind, werden im Feuer der Hölle sein, ewig darin zu bleiben. Das sind die schlechtesten Geschöpfe" [al-Bayyinah: 6].</w:t>
       </w:r>
     </w:p>
     <w:p>
@@ -15301,7 +15301,7 @@
         <w:t xml:space="preserve"> </w:t>
       </w:r>
       <w:r>
-        <w:t xml:space="preserve">[al-Māʾidah: 5].</w:t>
+        <w:t xml:space="preserve">„Und wer den Glauben verleugnet, dessen Werk wird hinfällig, und im Jenseits gehört er zu den Verlierern" [al-Māʾidah: 5].</w:t>
       </w:r>
     </w:p>
     <w:bookmarkEnd w:id="80"/>
@@ -15414,7 +15414,7 @@
         <w:t xml:space="preserve"> </w:t>
       </w:r>
       <w:r>
-        <w:t xml:space="preserve">[al-Ḥuǧurāt: 9]; das belegt, dass mit dem Unglauben hier in seinem Wort „Werdet nicht (wieder) zu Ungläubigen" der kleine Unglaube gemeint ist.</w:t>
+        <w:t xml:space="preserve">„Und wenn zwei Gruppen von den Gläubigen einander bekämpfen …" [al-Ḥuǧurāt: 9]; das belegt, dass mit dem Unglauben hier in seinem Wort „Werdet nicht (wieder) zu Ungläubigen" der kleine Unglaube gemeint ist.</w:t>
       </w:r>
     </w:p>
     <w:bookmarkEnd w:id="81"/>
@@ -15924,7 +15924,7 @@
         <w:t xml:space="preserve"> </w:t>
       </w:r>
       <w:r>
-        <w:t xml:space="preserve">[at-Tawbah: 100]. Die Bestätigung (tazkiyah) Allahs</w:t>
+        <w:t xml:space="preserve">„Und die Vorausgeeilten, die Ersten von den Auswanderern und den Helfern, und diejenigen, die ihnen in Güte gefolgt sind – Allah hat Wohlgefallen an ihnen, und sie haben Wohlgefallen an Ihm. Und Er hat für sie Gärten bereitet, durcheilt von Bächen, ewig und auf immer darin zu bleiben. Das ist der großartige Erfolg" [at-Tawbah: 100]. Die Bestätigung (tazkiyah) Allahs</w:t>
       </w:r>
       <w:r>
         <w:t xml:space="preserve"> </w:t>
@@ -15976,7 +15976,7 @@
         <w:t xml:space="preserve"> </w:t>
       </w:r>
       <w:r>
-        <w:t xml:space="preserve">[al-Ḥadīd: 10]. Die Ṣaḥābah haben (gleichsam) die Brücke überschritten (sie stehen über jedem Zweifel).</w:t>
+        <w:t xml:space="preserve">„Und allen hat Allah das Beste (das Paradies) versprochen" [al-Ḥadīd: 10]. Die Ṣaḥābah haben (gleichsam) die Brücke überschritten (sie stehen über jedem Zweifel).</w:t>
       </w:r>
     </w:p>
     <w:p>
@@ -16343,7 +16343,7 @@
         <w:t xml:space="preserve"> </w:t>
       </w:r>
       <w:r>
-        <w:t xml:space="preserve">[al-Ḥašr: 10]. Zu den Kennzeichen der Ahl as-Sunnah gehört, dass sie für die Gefährten des Gesandten Allahs um Barmherzigkeit und Vergebung bitten – im Gegensatz zu den Leuten der Neuerung (ahl al-bidaʿ). Von ʿĀʾišah wird überliefert, dass sie sagte:</w:t>
+        <w:t xml:space="preserve">„Und diejenigen, die nach ihnen gekommen sind, sagen: Unser Herr, vergib uns und unseren Brüdern, die uns im Glauben vorausgegangen sind, und lass in unseren Herzen keinen Groll sein gegen diejenigen, die glauben. Unser Herr, Du bist ja Gütig und Barmherzig" [al-Ḥašr: 10]. Zu den Kennzeichen der Ahl as-Sunnah gehört, dass sie für die Gefährten des Gesandten Allahs um Barmherzigkeit und Vergebung bitten – im Gegensatz zu den Leuten der Neuerung (ahl al-bidaʿ). Von ʿĀʾišah wird überliefert, dass sie sagte:</w:t>
       </w:r>
       <w:r>
         <w:t xml:space="preserve"> </w:t>
@@ -16526,7 +16526,7 @@
         <w:t xml:space="preserve"> </w:t>
       </w:r>
       <w:r>
-        <w:t xml:space="preserve">[at-Tawbah: 100]. Wer also will, dass Allah</w:t>
+        <w:t xml:space="preserve">„Und die Vorausgeeilten, die Ersten von den Auswanderern und den Helfern, und diejenigen, die ihnen in Güte gefolgt sind – Allah hat Wohlgefallen an ihnen, und sie haben Wohlgefallen an Ihm. Und Er hat für sie Gärten bereitet, durcheilt von Bächen, ewig und auf immer darin zu bleiben. Das ist der großartige Erfolg" [at-Tawbah: 100]. Wer also will, dass Allah</w:t>
       </w:r>
       <w:r>
         <w:t xml:space="preserve"> </w:t>
@@ -17194,7 +17194,7 @@
         <w:t xml:space="preserve"> </w:t>
       </w:r>
       <w:r>
-        <w:t xml:space="preserve">[an-Nisāʾ: 59]. Er befahl also den Gehorsam gegenüber dem Befehlshaber (walī al-amr), und der Grundsatz im Befehl ist, dass er Pflicht ist.</w:t>
+        <w:t xml:space="preserve">„O die ihr glaubt, gehorcht Allah, gehorcht dem Gesandten und den Befehlshabern unter euch" [an-Nisāʾ: 59]. Er befahl also den Gehorsam gegenüber dem Befehlshaber (walī al-amr), und der Grundsatz im Befehl ist, dass er Pflicht ist.</w:t>
       </w:r>
     </w:p>
     <w:p>

</xml_diff>

<commit_message>
Apply reviewer wording decisions: Herleitung, remove clause, diagram glosses
- "Quellen der Erkenntnis" → "Quellen der Herleitung" (closer to talaqqī);
  kept "Erkenntnis" where it renders maʿrifah (natural knowledge of Allah).
- Removed the clause "und erklärte ihr Blut für vergießbar" in the Rubūbiyyah
  section (S.20) per reviewer.
- Added German meanings to the transliterated terms in the overview diagram
  (Rubūbiyyah – Herrschaft · Asmāʾ waṣ-Ṣifāt – Namen u. Eigenschaften ·
  Ulūhiyyah – Anbetung).
- Rebuilt PDF, HTML, DOCX.

Co-Authored-By: Claude Sonnet 4.6 <noreply@anthropic.com>
Claude-Session: https://claude.ai/code/session_01X1aRXJ65Ndnus7RGkwMuBq
</commit_message>
<xml_diff>
--- a/aqidah_lektionen_deutsch_final.docx
+++ b/aqidah_lektionen_deutsch_final.docx
@@ -551,7 +551,7 @@
           <w:rPr>
             <w:rStyle w:val="Hyperlink"/>
           </w:rPr>
-          <w:t xml:space="preserve">Die Quellen der Erkenntnis (Maṣādir at-Talaqqī)</w:t>
+          <w:t xml:space="preserve">Die Quellen der Herleitung (Maṣādir at-Talaqqī)</w:t>
         </w:r>
       </w:hyperlink>
     </w:p>
@@ -962,7 +962,7 @@
         <w:pStyle w:val="Compact"/>
       </w:pPr>
       <w:r>
-        <w:t xml:space="preserve">Īmān billāh (Rubūbiyyah · Asmāʾ waṣ-Ṣifāt · Ulūhiyyah)</w:t>
+        <w:t xml:space="preserve">Īmān billāh – Glaube an Allah (Rubūbiyyah – Herrschaft · Asmāʾ waṣ-Ṣifāt – Namen u. Eigenschaften · Ulūhiyyah – Anbetung)</w:t>
       </w:r>
     </w:p>
     <w:p>
@@ -1319,7 +1319,7 @@
         <w:pStyle w:val="Heading2"/>
       </w:pPr>
       <w:r>
-        <w:t xml:space="preserve">Die Quellen der Erkenntnis (Maṣādir at-Talaqqī)</w:t>
+        <w:t xml:space="preserve">Die Quellen der Herleitung (Maṣādir at-Talaqqī)</w:t>
       </w:r>
     </w:p>
     <w:p>
@@ -1327,7 +1327,7 @@
         <w:pStyle w:val="FirstParagraph"/>
       </w:pPr>
       <w:r>
-        <w:t xml:space="preserve">Abb. 2 — Die Erkenntnisquellen bei Ahl as-Sunnah wal-Jamāʿah (مصدر التلقي)</w:t>
+        <w:t xml:space="preserve">Abb. 2 — Die Herleitungsquellen bei Ahl as-Sunnah wal-Jamāʿah (مصدر التلقي)</w:t>
       </w:r>
     </w:p>
     <w:p>
@@ -1338,7 +1338,7 @@
         <w:t xml:space="preserve">مصدر التلقي عند أهل السنة والجماعة</w:t>
       </w:r>
       <w:r>
-        <w:t xml:space="preserve">Quelle der Erkenntnis bei Ahl as-Sunnah wal-Jamāʿah</w:t>
+        <w:t xml:space="preserve">Quelle der Herleitung bei Ahl as-Sunnah wal-Jamāʿah</w:t>
       </w:r>
     </w:p>
     <w:p>
@@ -1431,15 +1431,15 @@
         <w:pStyle w:val="BodyText"/>
       </w:pPr>
       <w:r>
-        <w:t xml:space="preserve">Mit „Quelle der Erkenntnis" (maṣdar at-talaqqī) ist gemeint: Woher wird die ʿAqīdah entnommen?</w:t>
-      </w:r>
-    </w:p>
-    <w:p>
-      <w:pPr>
-        <w:pStyle w:val="BodyText"/>
-      </w:pPr>
-      <w:r>
-        <w:t xml:space="preserve">Die Quelle der Erkenntnis bei Ahl as-Sunnah wal-Jamāʿah geht auf drei Dinge zurück:</w:t>
+        <w:t xml:space="preserve">Mit „Quelle der Herleitung" (maṣdar at-talaqqī) ist gemeint: Woher wird die ʿAqīdah entnommen?</w:t>
+      </w:r>
+    </w:p>
+    <w:p>
+      <w:pPr>
+        <w:pStyle w:val="BodyText"/>
+      </w:pPr>
+      <w:r>
+        <w:t xml:space="preserve">Die Quelle der Herleitung bei Ahl as-Sunnah wal-Jamāʿah geht auf drei Dinge zurück:</w:t>
       </w:r>
     </w:p>
     <w:p>
@@ -1599,7 +1599,7 @@
         <w:pStyle w:val="BodyText"/>
       </w:pPr>
       <w:r>
-        <w:t xml:space="preserve">Dies sind die Quellen der Erkenntnis bei Ahl as-Sunnah wal-Jamāʿah.</w:t>
+        <w:t xml:space="preserve">Dies sind die Quellen der Herleitung bei Ahl as-Sunnah wal-Jamāʿah.</w:t>
       </w:r>
     </w:p>
     <w:p>
@@ -3406,10 +3406,7 @@
         <w:t xml:space="preserve">ﷺ</w:t>
       </w:r>
       <w:r>
-        <w:t xml:space="preserve"> </w:t>
-      </w:r>
-      <w:r>
-        <w:t xml:space="preserve">und erklärte ihr Blut für vergießbar. Das ist so, weil dieser Tawḥīd allein nicht genügt.</w:t>
+        <w:t xml:space="preserve">. Das ist so, weil dieser Tawḥīd allein nicht genügt.</w:t>
       </w:r>
     </w:p>
     <w:p>

</xml_diff>

<commit_message>
Apply final reviewer fixes: Beistand→Hilfe/Unterstützung, akuff→Hände
- S.15: "Beistand" → "Hilfe (Unterstützung)" for Wilāyat Allāh / nāṣir al-muʾminīn.
- S.41: corrected mistranslation of "لهم أكف" (lahum akuff) — it means the angels
  "haben Hände (Handflächen)", not "kehren ein".
- Rebuilt PDF, HTML, DOCX.

Co-Authored-By: Claude Sonnet 4.6 <noreply@anthropic.com>
Claude-Session: https://claude.ai/code/session_01X1aRXJ65Ndnus7RGkwMuBq
</commit_message>
<xml_diff>
--- a/aqidah_lektionen_deutsch_final.docx
+++ b/aqidah_lektionen_deutsch_final.docx
@@ -2558,7 +2558,7 @@
         <w:t xml:space="preserve"> </w:t>
       </w:r>
       <w:r>
-        <w:t xml:space="preserve">(Wilāyat Allāh) und Sein Beistand. Wer also will, dass Allah ihm beisteht, der verwirkliche den Glauben an Allah</w:t>
+        <w:t xml:space="preserve">(Wilāyat Allāh) und Seine Hilfe (Unterstützung). Wer also will, dass Allah ihm hilft, der verwirkliche den Glauben an Allah</w:t>
       </w:r>
       <w:r>
         <w:t xml:space="preserve"> </w:t>
@@ -2599,7 +2599,7 @@
         <w:pStyle w:val="BodyText"/>
       </w:pPr>
       <w:r>
-        <w:t xml:space="preserve">Das heißt: der Beistand der Gläubigen.</w:t>
+        <w:t xml:space="preserve">Das heißt: die Hilfe (Unterstützung) der Gläubigen.</w:t>
       </w:r>
     </w:p>
     <w:p>
@@ -7922,7 +7922,7 @@
           <w:bCs/>
           <w:b/>
         </w:rPr>
-        <w:t xml:space="preserve">Sie kehren ein, hören, sitzen, steigen herab</w:t>
+        <w:t xml:space="preserve">Sie haben Hände (Handflächen), hören, sitzen, steigen herab</w:t>
       </w:r>
       <w:r>
         <w:t xml:space="preserve"> </w:t>

</xml_diff>